<commit_message>
Auto-install Python and Node.js in run.bat
Previously run.bat only checked for Python and Node and told the user to go
install them, which meant handing the project to someone else came with two
manual prerequisites. It now installs both with winget, which ships with
Windows 10 1709 and later, and falls back to clear manual instructions when
winget is unavailable.

Also fixes a bug in the PATH refresh helper written for this: rebuilding PATH
from the registry corrupted it, because registry Path values are REG_EXPAND_SZ
holding unexpanded %VAR% references that do not survive assignment in batch.
That silently dropped the WindowsApps folder winget itself lives in, so a
second winget call after an install would fail. The helper now appends the
standard install locations instead, which cannot break an entry that already
worked. Verified: winget, python and node all resolve both before and after
the refresh.

Co-Authored-By: Claude Opus 5 (1M context) <noreply@anthropic.com>
</commit_message>
<xml_diff>
--- a/InterviewAI/PROJECT_DOCS.docx
+++ b/InterviewAI/PROJECT_DOCS.docx
@@ -280,7 +280,7 @@
                 <w:rFonts w:ascii="Arial" w:hAnsi="Arial"/>
                 <w:sz w:val="19"/>
               </w:rPr>
-              <w:t>python.org/downloads</w:t>
+              <w:t>Installed automatically</w:t>
             </w:r>
           </w:p>
         </w:tc>
@@ -295,7 +295,7 @@
                 <w:rFonts w:ascii="Arial" w:hAnsi="Arial"/>
                 <w:sz w:val="19"/>
               </w:rPr>
-              <w:t>Tick "Add python.exe to PATH" during install</w:t>
+              <w:t>run.bat installs it via winget if missing</w:t>
             </w:r>
           </w:p>
         </w:tc>
@@ -312,7 +312,7 @@
                 <w:rFonts w:ascii="Arial" w:hAnsi="Arial"/>
                 <w:sz w:val="19"/>
               </w:rPr>
-              <w:t>Node.js 18+</w:t>
+              <w:t>Node.js LTS</w:t>
             </w:r>
           </w:p>
         </w:tc>
@@ -327,7 +327,7 @@
                 <w:rFonts w:ascii="Arial" w:hAnsi="Arial"/>
                 <w:sz w:val="19"/>
               </w:rPr>
-              <w:t>nodejs.org</w:t>
+              <w:t>Installed automatically</w:t>
             </w:r>
           </w:p>
         </w:tc>
@@ -342,7 +342,7 @@
                 <w:rFonts w:ascii="Arial" w:hAnsi="Arial"/>
                 <w:sz w:val="19"/>
               </w:rPr>
-              <w:t>LTS version</w:t>
+              <w:t>run.bat installs it via winget if missing</w:t>
             </w:r>
           </w:p>
         </w:tc>
@@ -529,6 +529,21 @@
           <w:sz w:val="19"/>
         </w:rPr>
         <w:t>run.bat</w:t>
+      </w:r>
+    </w:p>
+    <w:p>
+      <w:pPr>
+        <w:spacing w:line="324" w:lineRule="auto"/>
+        <w:jc w:val="both"/>
+      </w:pPr>
+      <w:r>
+        <w:rPr>
+          <w:rFonts w:ascii="Arial" w:hAnsi="Arial"/>
+          <w:b w:val="0"/>
+          <w:i w:val="0"/>
+          <w:sz w:val="21"/>
+        </w:rPr>
+        <w:t>If Python or Node.js are missing, run.bat installs them with winget, which ships with Windows 10 1709 and later. After an automatic install the script asks you to close the window and run it once more, so Windows picks up the new PATH. If winget is not available it says exactly what to install by hand.</w:t>
       </w:r>
     </w:p>
     <w:p>

</xml_diff>